<commit_message>
Backup: cover connected assets (CRM + automation fleet + gateway config); update PLAN-DR
mc-asset-backup now exports the full Supabase set (adds CRM: contacts/companies/deals, ~6.9k
rows) beyond tasks/activities, and captures the 69 com.exos.* LaunchAgents (automation fleet)
and OpenClaw gateway config (openclaw.json, exec-approvals). So a restore brings back the data
AND the automation/integrations. PLAN-DR updated to document connected-asset coverage + the
vendor-durable SaaS list. Verified 0 checksum mismatches.

Co-Authored-By: Claude Opus 4.8 <noreply@anthropic.com>
</commit_message>
<xml_diff>
--- a/process-library/cmmc-2.0/PLAN-DR_Cyber_Disaster_Response_&_Recovery_Plan.docx
+++ b/process-library/cmmc-2.0/PLAN-DR_Cyber_Disaster_Response_&_Recovery_Plan.docx
@@ -371,7 +371,35 @@
           <w:sz-cs w:val="29"/>
           <w:spacing w:val="0"/>
         </w:rPr>
-        <w:t xml:space="preserve">_____ Captures: mc.db (consistent sqlite online backup), mission-control/data, uploads, process-library, capture, config, users.json, .ds-passcode, ~/.openclaw/secrets.json, key notes, and a Supabase export (tasks + activities JSON).</w:t>
+        <w:t xml:space="preserve">_____ Captures MC's own data: mc.db (consistent sqlite online backup), mission-control/data, uploads, process-library, capture, config, users.json, .ds-passcode, ~/.openclaw/secrets.json, key notes.</w:t>
+      </w:r>
+    </w:p>
+    <w:p>
+      <w:pPr>
+        <w:spacing w:after="40"/>
+      </w:pPr>
+      <w:r>
+        <w:rPr>
+          <w:rFonts w:ascii="Arial" w:hAnsi="Arial" w:cs="Arial"/>
+          <w:sz w:val="29"/>
+          <w:sz-cs w:val="29"/>
+          <w:spacing w:val="0"/>
+        </w:rPr>
+        <w:t xml:space="preserve">_____ Captures CONNECTED assets: the full Supabase cloud set (board tasks/activities AND the CRM - contacts, companies, deals), the 69-job automation fleet (~/Library/LaunchAgents/com.exos.*.plist), and the OpenClaw gateway config (openclaw.json, exec-approvals). This restores not just the data but the automation and integrations that make MC run.</w:t>
+      </w:r>
+    </w:p>
+    <w:p>
+      <w:pPr>
+        <w:spacing w:after="40"/>
+      </w:pPr>
+      <w:r>
+        <w:rPr>
+          <w:rFonts w:ascii="Arial" w:hAnsi="Arial" w:cs="Arial"/>
+          <w:sz w:val="29"/>
+          <w:sz-cs w:val="29"/>
+          <w:spacing w:val="0"/>
+        </w:rPr>
+        <w:t xml:space="preserve">_____ External SaaS that connect in (QuickBooks, BambooHR, Cloudflare Zero Trust, Proton, DocuSign) are vendor-durable; recovery reconnects via the backed-up secrets, and BambooHR/QuickBooks data can be re-exported. These are noted in the inventory, not duplicated here.</w:t>
       </w:r>
     </w:p>
     <w:p>

</xml_diff>